<commit_message>
docs: update OnePage with Aily dual-entry flow
</commit_message>
<xml_diff>
--- a/docs/OneKOS-复赛OnePage.docx
+++ b/docs/OneKOS-复赛OnePage.docx
@@ -14,7 +14,7 @@
     </w:p>
     <w:p>
       <w:pPr>
-        <w:spacing w:after="80" w:line="276" w:lineRule="auto"/>
+        <w:spacing w:after="60" w:line="269" w:lineRule="auto"/>
         <w:ind w:left="255" w:right="255"/>
       </w:pPr>
       <w:r>
@@ -122,7 +122,7 @@
           </w:tcPr>
           <w:p>
             <w:pPr>
-              <w:spacing w:after="80" w:line="276" w:lineRule="auto"/>
+              <w:spacing w:after="60" w:line="269" w:lineRule="auto"/>
             </w:pPr>
             <w:r>
               <w:rPr>
@@ -154,7 +154,7 @@
           </w:tcPr>
           <w:p>
             <w:pPr>
-              <w:spacing w:after="80" w:line="276" w:lineRule="auto"/>
+              <w:spacing w:after="60" w:line="269" w:lineRule="auto"/>
             </w:pPr>
             <w:r>
               <w:rPr>
@@ -192,7 +192,7 @@
           </w:tcPr>
           <w:p>
             <w:pPr>
-              <w:spacing w:after="80" w:line="276" w:lineRule="auto"/>
+              <w:spacing w:after="60" w:line="269" w:lineRule="auto"/>
             </w:pPr>
             <w:r>
               <w:rPr>
@@ -225,7 +225,7 @@
           </w:tcPr>
           <w:p>
             <w:pPr>
-              <w:spacing w:after="80" w:line="276" w:lineRule="auto"/>
+              <w:spacing w:after="60" w:line="269" w:lineRule="auto"/>
             </w:pPr>
             <w:r>
               <w:rPr>
@@ -262,7 +262,7 @@
           </w:tcPr>
           <w:p>
             <w:pPr>
-              <w:spacing w:after="80" w:line="276" w:lineRule="auto"/>
+              <w:spacing w:after="60" w:line="269" w:lineRule="auto"/>
             </w:pPr>
             <w:r>
               <w:rPr>
@@ -294,7 +294,7 @@
           </w:tcPr>
           <w:p>
             <w:pPr>
-              <w:spacing w:after="80" w:line="276" w:lineRule="auto"/>
+              <w:spacing w:after="60" w:line="269" w:lineRule="auto"/>
             </w:pPr>
             <w:r>
               <w:rPr>
@@ -332,7 +332,7 @@
           </w:tcPr>
           <w:p>
             <w:pPr>
-              <w:spacing w:after="80" w:line="276" w:lineRule="auto"/>
+              <w:spacing w:after="60" w:line="269" w:lineRule="auto"/>
             </w:pPr>
             <w:r>
               <w:rPr>
@@ -365,7 +365,7 @@
           </w:tcPr>
           <w:p>
             <w:pPr>
-              <w:spacing w:after="80" w:line="276" w:lineRule="auto"/>
+              <w:spacing w:after="60" w:line="269" w:lineRule="auto"/>
             </w:pPr>
             <w:r>
               <w:rPr>
@@ -402,7 +402,7 @@
           </w:tcPr>
           <w:p>
             <w:pPr>
-              <w:spacing w:after="80" w:line="276" w:lineRule="auto"/>
+              <w:spacing w:after="60" w:line="269" w:lineRule="auto"/>
             </w:pPr>
             <w:r>
               <w:rPr>
@@ -434,7 +434,7 @@
           </w:tcPr>
           <w:p>
             <w:pPr>
-              <w:spacing w:after="80" w:line="276" w:lineRule="auto"/>
+              <w:spacing w:after="60" w:line="269" w:lineRule="auto"/>
             </w:pPr>
             <w:r>
               <w:rPr>
@@ -472,7 +472,7 @@
           </w:tcPr>
           <w:p>
             <w:pPr>
-              <w:spacing w:after="80" w:line="276" w:lineRule="auto"/>
+              <w:spacing w:after="60" w:line="269" w:lineRule="auto"/>
             </w:pPr>
             <w:r>
               <w:rPr>
@@ -505,7 +505,7 @@
           </w:tcPr>
           <w:p>
             <w:pPr>
-              <w:spacing w:after="80" w:line="276" w:lineRule="auto"/>
+              <w:spacing w:after="60" w:line="269" w:lineRule="auto"/>
             </w:pPr>
             <w:r>
               <w:rPr>
@@ -542,7 +542,7 @@
     </w:p>
     <w:p>
       <w:pPr>
-        <w:spacing w:after="80" w:line="276" w:lineRule="auto"/>
+        <w:spacing w:after="60" w:line="269" w:lineRule="auto"/>
       </w:pPr>
       <w:r>
         <w:rPr>
@@ -555,7 +555,7 @@
     </w:p>
     <w:p>
       <w:pPr>
-        <w:spacing w:after="80" w:line="276" w:lineRule="auto"/>
+        <w:spacing w:after="60" w:line="269" w:lineRule="auto"/>
       </w:pPr>
       <w:r>
         <w:rPr>
@@ -662,7 +662,7 @@
           </w:tcPr>
           <w:p>
             <w:pPr>
-              <w:spacing w:after="80" w:line="276" w:lineRule="auto"/>
+              <w:spacing w:after="60" w:line="269" w:lineRule="auto"/>
             </w:pPr>
             <w:r>
               <w:rPr>
@@ -694,7 +694,7 @@
           </w:tcPr>
           <w:p>
             <w:pPr>
-              <w:spacing w:after="80" w:line="276" w:lineRule="auto"/>
+              <w:spacing w:after="60" w:line="269" w:lineRule="auto"/>
             </w:pPr>
             <w:r>
               <w:rPr>
@@ -732,7 +732,7 @@
           </w:tcPr>
           <w:p>
             <w:pPr>
-              <w:spacing w:after="80" w:line="276" w:lineRule="auto"/>
+              <w:spacing w:after="60" w:line="269" w:lineRule="auto"/>
             </w:pPr>
             <w:r>
               <w:rPr>
@@ -765,7 +765,7 @@
           </w:tcPr>
           <w:p>
             <w:pPr>
-              <w:spacing w:after="80" w:line="276" w:lineRule="auto"/>
+              <w:spacing w:after="60" w:line="269" w:lineRule="auto"/>
             </w:pPr>
             <w:r>
               <w:rPr>
@@ -802,7 +802,7 @@
           </w:tcPr>
           <w:p>
             <w:pPr>
-              <w:spacing w:after="80" w:line="276" w:lineRule="auto"/>
+              <w:spacing w:after="60" w:line="269" w:lineRule="auto"/>
             </w:pPr>
             <w:r>
               <w:rPr>
@@ -834,7 +834,7 @@
           </w:tcPr>
           <w:p>
             <w:pPr>
-              <w:spacing w:after="80" w:line="276" w:lineRule="auto"/>
+              <w:spacing w:after="60" w:line="269" w:lineRule="auto"/>
             </w:pPr>
             <w:r>
               <w:rPr>
@@ -872,7 +872,7 @@
           </w:tcPr>
           <w:p>
             <w:pPr>
-              <w:spacing w:after="80" w:line="276" w:lineRule="auto"/>
+              <w:spacing w:after="60" w:line="269" w:lineRule="auto"/>
             </w:pPr>
             <w:r>
               <w:rPr>
@@ -905,7 +905,7 @@
           </w:tcPr>
           <w:p>
             <w:pPr>
-              <w:spacing w:after="80" w:line="276" w:lineRule="auto"/>
+              <w:spacing w:after="60" w:line="269" w:lineRule="auto"/>
             </w:pPr>
             <w:r>
               <w:rPr>
@@ -942,7 +942,7 @@
           </w:tcPr>
           <w:p>
             <w:pPr>
-              <w:spacing w:after="80" w:line="276" w:lineRule="auto"/>
+              <w:spacing w:after="60" w:line="269" w:lineRule="auto"/>
             </w:pPr>
             <w:r>
               <w:rPr>
@@ -974,7 +974,7 @@
           </w:tcPr>
           <w:p>
             <w:pPr>
-              <w:spacing w:after="80" w:line="276" w:lineRule="auto"/>
+              <w:spacing w:after="60" w:line="269" w:lineRule="auto"/>
             </w:pPr>
             <w:r>
               <w:rPr>
@@ -1006,7 +1006,7 @@
         <w:spacing w:before="160" w:after="80"/>
       </w:pPr>
       <w:r>
-        <w:t>3. 具体方案：多维表格＋Aily＋机器人卡片</w:t>
+        <w:t>3. 具体方案：Web 与 Aily 双入口＋统一后端＋共享数据</w:t>
       </w:r>
     </w:p>
     <w:p>
@@ -1024,24 +1024,32 @@
         <w:br/>
         <w:t xml:space="preserve">                         ↓</w:t>
         <w:br/>
-        <w:t xml:space="preserve">        飞书多维表格：七张业务数据表与流程状态</w:t>
+        <w:t xml:space="preserve">      飞书多维表格：七张共享业务数据表与流程状态</w:t>
+        <w:br/>
+        <w:t xml:space="preserve">                         ↕</w:t>
+        <w:br/>
+        <w:t xml:space="preserve">               OneKOS 统一业务后端</w:t>
+        <w:br/>
+        <w:t xml:space="preserve">       画像 / 路由 / 内容生成 / 四重质检 / 评论转线索</w:t>
+        <w:br/>
+        <w:t xml:space="preserve">                 ↙                 ↘</w:t>
+        <w:br/>
+        <w:t xml:space="preserve">       Web 工作台入口              飞书 Aily 入口</w:t>
+        <w:br/>
+        <w:t xml:space="preserve">  页面操作完整业务流程       与智能体以对话形式进行查询和发起任务</w:t>
+        <w:br/>
+        <w:t xml:space="preserve">                 ↘                 ↙</w:t>
+        <w:br/>
+        <w:t xml:space="preserve">       顾问选择 / 补素材 / 确认 / 接管线索</w:t>
         <w:br/>
         <w:t xml:space="preserve">                         ↓</w:t>
         <w:br/>
-        <w:t xml:space="preserve">      Aily：校准、路由、生成、质检、评论转线索五项技能</w:t>
-        <w:br/>
-        <w:t xml:space="preserve">                         ↓</w:t>
-        <w:br/>
-        <w:t xml:space="preserve">       机器人卡片：顾问选择、补素材、确认、接管线索</w:t>
-        <w:br/>
-        <w:t xml:space="preserve">                         ↓</w:t>
-        <w:br/>
-        <w:t xml:space="preserve">              反馈事件写回，动态内容 DNA 更新</w:t>
+        <w:t xml:space="preserve">             反馈写回共享多维表格，更新内容 DNA</w:t>
       </w:r>
     </w:p>
     <w:p>
       <w:pPr>
-        <w:spacing w:after="80" w:line="276" w:lineRule="auto"/>
+        <w:spacing w:after="60" w:line="269" w:lineRule="auto"/>
       </w:pPr>
       <w:r>
         <w:rPr>
@@ -1049,13 +1057,26 @@
           <w:color w:val="253047"/>
           <w:sz w:val="19"/>
         </w:rPr>
-        <w:t>多维表格保存顾问档案、画像标签、品牌知识、内容任务、内容成果、评论线索和反馈事件。Aily 读取结构化证据，完成五类工作：</w:t>
+        <w:t>Web 工作台和飞书 Aily 是面向顾问的两套交互入口，本质上使用同一套 OneKOS 后端能力，并共享同一份飞书多维表格数据。多维表格保存顾问档案、画像标签、品牌知识、内容任务、内容成果、评论线索和反馈事件；统一后端读取结构化证据，完成五类工作：</w:t>
+      </w:r>
+    </w:p>
+    <w:p>
+      <w:pPr>
+        <w:spacing w:after="60" w:line="269" w:lineRule="auto"/>
+      </w:pPr>
+      <w:r>
+        <w:rPr>
+          <w:rFonts w:ascii="Microsoft YaHei" w:hAnsi="Microsoft YaHei" w:eastAsia="Microsoft YaHei"/>
+          <w:color w:val="253047"/>
+          <w:sz w:val="19"/>
+        </w:rPr>
+        <w:t>当前 Web 已能调用 OneKOS 后端展示完整流程；Aily 已能在飞书群中读取共享多维表格。Aily 调用同一后端发起生成和推进流程是下一阶段的发展方向，接通后不会另建一套业务逻辑或数据，而是复用 Web 已有的后端服务和 Base 数据底座。</w:t>
       </w:r>
     </w:p>
     <w:p>
       <w:pPr>
         <w:pStyle w:val="ListNumber"/>
-        <w:spacing w:after="80" w:line="276" w:lineRule="auto"/>
+        <w:spacing w:after="60" w:line="269" w:lineRule="auto"/>
       </w:pPr>
       <w:r>
         <w:rPr>
@@ -1078,7 +1099,7 @@
     <w:p>
       <w:pPr>
         <w:pStyle w:val="ListNumber"/>
-        <w:spacing w:after="80" w:line="276" w:lineRule="auto"/>
+        <w:spacing w:after="60" w:line="269" w:lineRule="auto"/>
       </w:pPr>
       <w:r>
         <w:rPr>
@@ -1101,7 +1122,7 @@
     <w:p>
       <w:pPr>
         <w:pStyle w:val="ListNumber"/>
-        <w:spacing w:after="80" w:line="276" w:lineRule="auto"/>
+        <w:spacing w:after="60" w:line="269" w:lineRule="auto"/>
       </w:pPr>
       <w:r>
         <w:rPr>
@@ -1124,7 +1145,7 @@
     <w:p>
       <w:pPr>
         <w:pStyle w:val="ListNumber"/>
-        <w:spacing w:after="80" w:line="276" w:lineRule="auto"/>
+        <w:spacing w:after="60" w:line="269" w:lineRule="auto"/>
       </w:pPr>
       <w:r>
         <w:rPr>
@@ -1147,7 +1168,7 @@
     <w:p>
       <w:pPr>
         <w:pStyle w:val="ListNumber"/>
-        <w:spacing w:after="80" w:line="276" w:lineRule="auto"/>
+        <w:spacing w:after="60" w:line="269" w:lineRule="auto"/>
       </w:pPr>
       <w:r>
         <w:rPr>
@@ -1291,7 +1312,7 @@
           </w:tcPr>
           <w:p>
             <w:pPr>
-              <w:spacing w:after="80" w:line="276" w:lineRule="auto"/>
+              <w:spacing w:after="60" w:line="269" w:lineRule="auto"/>
             </w:pPr>
             <w:r>
               <w:rPr>
@@ -1323,7 +1344,7 @@
           </w:tcPr>
           <w:p>
             <w:pPr>
-              <w:spacing w:after="80" w:line="276" w:lineRule="auto"/>
+              <w:spacing w:after="60" w:line="269" w:lineRule="auto"/>
             </w:pPr>
             <w:r>
               <w:rPr>
@@ -1355,7 +1376,7 @@
           </w:tcPr>
           <w:p>
             <w:pPr>
-              <w:spacing w:after="80" w:line="276" w:lineRule="auto"/>
+              <w:spacing w:after="60" w:line="269" w:lineRule="auto"/>
             </w:pPr>
             <w:r>
               <w:rPr>
@@ -1393,7 +1414,7 @@
           </w:tcPr>
           <w:p>
             <w:pPr>
-              <w:spacing w:after="80" w:line="276" w:lineRule="auto"/>
+              <w:spacing w:after="60" w:line="269" w:lineRule="auto"/>
             </w:pPr>
             <w:r>
               <w:rPr>
@@ -1426,7 +1447,7 @@
           </w:tcPr>
           <w:p>
             <w:pPr>
-              <w:spacing w:after="80" w:line="276" w:lineRule="auto"/>
+              <w:spacing w:after="60" w:line="269" w:lineRule="auto"/>
             </w:pPr>
             <w:r>
               <w:rPr>
@@ -1459,7 +1480,7 @@
           </w:tcPr>
           <w:p>
             <w:pPr>
-              <w:spacing w:after="80" w:line="276" w:lineRule="auto"/>
+              <w:spacing w:after="60" w:line="269" w:lineRule="auto"/>
             </w:pPr>
             <w:r>
               <w:rPr>
@@ -1496,7 +1517,7 @@
           </w:tcPr>
           <w:p>
             <w:pPr>
-              <w:spacing w:after="80" w:line="276" w:lineRule="auto"/>
+              <w:spacing w:after="60" w:line="269" w:lineRule="auto"/>
             </w:pPr>
             <w:r>
               <w:rPr>
@@ -1528,7 +1549,7 @@
           </w:tcPr>
           <w:p>
             <w:pPr>
-              <w:spacing w:after="80" w:line="276" w:lineRule="auto"/>
+              <w:spacing w:after="60" w:line="269" w:lineRule="auto"/>
             </w:pPr>
             <w:r>
               <w:rPr>
@@ -1560,7 +1581,7 @@
           </w:tcPr>
           <w:p>
             <w:pPr>
-              <w:spacing w:after="80" w:line="276" w:lineRule="auto"/>
+              <w:spacing w:after="60" w:line="269" w:lineRule="auto"/>
             </w:pPr>
             <w:r>
               <w:rPr>
@@ -1598,7 +1619,7 @@
           </w:tcPr>
           <w:p>
             <w:pPr>
-              <w:spacing w:after="80" w:line="276" w:lineRule="auto"/>
+              <w:spacing w:after="60" w:line="269" w:lineRule="auto"/>
             </w:pPr>
             <w:r>
               <w:rPr>
@@ -1631,7 +1652,7 @@
           </w:tcPr>
           <w:p>
             <w:pPr>
-              <w:spacing w:after="80" w:line="276" w:lineRule="auto"/>
+              <w:spacing w:after="60" w:line="269" w:lineRule="auto"/>
             </w:pPr>
             <w:r>
               <w:rPr>
@@ -1664,7 +1685,7 @@
           </w:tcPr>
           <w:p>
             <w:pPr>
-              <w:spacing w:after="80" w:line="276" w:lineRule="auto"/>
+              <w:spacing w:after="60" w:line="269" w:lineRule="auto"/>
             </w:pPr>
             <w:r>
               <w:rPr>
@@ -1701,7 +1722,7 @@
           </w:tcPr>
           <w:p>
             <w:pPr>
-              <w:spacing w:after="80" w:line="276" w:lineRule="auto"/>
+              <w:spacing w:after="60" w:line="269" w:lineRule="auto"/>
             </w:pPr>
             <w:r>
               <w:rPr>
@@ -1733,7 +1754,7 @@
           </w:tcPr>
           <w:p>
             <w:pPr>
-              <w:spacing w:after="80" w:line="276" w:lineRule="auto"/>
+              <w:spacing w:after="60" w:line="269" w:lineRule="auto"/>
             </w:pPr>
             <w:r>
               <w:rPr>
@@ -1765,7 +1786,7 @@
           </w:tcPr>
           <w:p>
             <w:pPr>
-              <w:spacing w:after="80" w:line="276" w:lineRule="auto"/>
+              <w:spacing w:after="60" w:line="269" w:lineRule="auto"/>
             </w:pPr>
             <w:r>
               <w:rPr>
@@ -1793,7 +1814,7 @@
     </w:p>
     <w:p>
       <w:pPr>
-        <w:spacing w:after="80" w:line="276" w:lineRule="auto"/>
+        <w:spacing w:after="60" w:line="269" w:lineRule="auto"/>
       </w:pPr>
       <w:r>
         <w:rPr>
@@ -1819,6 +1840,58 @@
           <w:sz w:val="19"/>
         </w:rPr>
         <w:t>，预计投入 8—12 分钟。</w:t>
+      </w:r>
+    </w:p>
+    <w:p>
+      <w:pPr>
+        <w:pStyle w:val="Heading2"/>
+        <w:spacing w:before="120" w:after="60"/>
+      </w:pPr>
+      <w:r>
+        <w:t>Aily 低负担使用方式</w:t>
+      </w:r>
+    </w:p>
+    <w:p>
+      <w:pPr>
+        <w:spacing w:after="60" w:line="269" w:lineRule="auto"/>
+      </w:pPr>
+      <w:r>
+        <w:rPr>
+          <w:rFonts w:ascii="Microsoft YaHei" w:hAnsi="Microsoft YaHei" w:eastAsia="Microsoft YaHei"/>
+          <w:color w:val="253047"/>
+          <w:sz w:val="19"/>
+        </w:rPr>
+        <w:t>Aily 是 Web 工作台之外的飞书内交互入口，重点解决顾问“找入口、查数据、记流程”的负担。当前已将「千面·OneKOS 内容搭档」加入飞书群，并连接团队共享的飞书多维表格。顾问可以直接在群里 @Aily，使用自然语言查询顾问画像、内容任务、内容成果和评论线索，Aily 读取对应表格记录后返回结果。</w:t>
+      </w:r>
+    </w:p>
+    <w:p>
+      <w:pPr>
+        <w:spacing w:after="60" w:line="269" w:lineRule="auto"/>
+      </w:pPr>
+      <w:r>
+        <w:rPr>
+          <w:rFonts w:ascii="Microsoft YaHei" w:hAnsi="Microsoft YaHei" w:eastAsia="Microsoft YaHei"/>
+          <w:color w:val="253047"/>
+          <w:sz w:val="19"/>
+        </w:rPr>
+        <w:t>本阶段 Aily 主要负责</w:t>
+      </w:r>
+      <w:r>
+        <w:rPr>
+          <w:rFonts w:ascii="Microsoft YaHei" w:hAnsi="Microsoft YaHei" w:eastAsia="Microsoft YaHei"/>
+          <w:b/>
+          <w:color w:val="253047"/>
+          <w:sz w:val="19"/>
+        </w:rPr>
+        <w:t>读取多维表格、解释相关内容等</w:t>
+      </w:r>
+      <w:r>
+        <w:rPr>
+          <w:rFonts w:ascii="Microsoft YaHei" w:hAnsi="Microsoft YaHei" w:eastAsia="Microsoft YaHei"/>
+          <w:color w:val="253047"/>
+          <w:sz w:val="19"/>
+        </w:rPr>
+        <w:t>，内容生成、四重质检和业务闭环仍由现有 Web Demo 展示。下一阶段再将同一套 OneKOS 后端部署为 Aily 可访问的服务，让顾问可以通过聊天发起内容生成、查询执行状态等一系列操作；执行结果仍写回双方共享的飞书多维表格。</w:t>
       </w:r>
     </w:p>
     <w:p>
@@ -1917,7 +1990,7 @@
           </w:tcPr>
           <w:p>
             <w:pPr>
-              <w:spacing w:after="80" w:line="276" w:lineRule="auto"/>
+              <w:spacing w:after="60" w:line="269" w:lineRule="auto"/>
             </w:pPr>
             <w:r>
               <w:rPr>
@@ -1949,7 +2022,7 @@
           </w:tcPr>
           <w:p>
             <w:pPr>
-              <w:spacing w:after="80" w:line="276" w:lineRule="auto"/>
+              <w:spacing w:after="60" w:line="269" w:lineRule="auto"/>
             </w:pPr>
             <w:r>
               <w:rPr>
@@ -1987,7 +2060,7 @@
           </w:tcPr>
           <w:p>
             <w:pPr>
-              <w:spacing w:after="80" w:line="276" w:lineRule="auto"/>
+              <w:spacing w:after="60" w:line="269" w:lineRule="auto"/>
             </w:pPr>
             <w:r>
               <w:rPr>
@@ -2020,7 +2093,7 @@
           </w:tcPr>
           <w:p>
             <w:pPr>
-              <w:spacing w:after="80" w:line="276" w:lineRule="auto"/>
+              <w:spacing w:after="60" w:line="269" w:lineRule="auto"/>
             </w:pPr>
             <w:r>
               <w:rPr>
@@ -2057,7 +2130,7 @@
           </w:tcPr>
           <w:p>
             <w:pPr>
-              <w:spacing w:after="80" w:line="276" w:lineRule="auto"/>
+              <w:spacing w:after="60" w:line="269" w:lineRule="auto"/>
             </w:pPr>
             <w:r>
               <w:rPr>
@@ -2089,7 +2162,7 @@
           </w:tcPr>
           <w:p>
             <w:pPr>
-              <w:spacing w:after="80" w:line="276" w:lineRule="auto"/>
+              <w:spacing w:after="60" w:line="269" w:lineRule="auto"/>
             </w:pPr>
             <w:r>
               <w:rPr>
@@ -2127,7 +2200,7 @@
           </w:tcPr>
           <w:p>
             <w:pPr>
-              <w:spacing w:after="80" w:line="276" w:lineRule="auto"/>
+              <w:spacing w:after="60" w:line="269" w:lineRule="auto"/>
             </w:pPr>
             <w:r>
               <w:rPr>
@@ -2160,7 +2233,7 @@
           </w:tcPr>
           <w:p>
             <w:pPr>
-              <w:spacing w:after="80" w:line="276" w:lineRule="auto"/>
+              <w:spacing w:after="60" w:line="269" w:lineRule="auto"/>
             </w:pPr>
             <w:r>
               <w:rPr>
@@ -2310,7 +2383,7 @@
           </w:tcPr>
           <w:p>
             <w:pPr>
-              <w:spacing w:after="80" w:line="276" w:lineRule="auto"/>
+              <w:spacing w:after="60" w:line="269" w:lineRule="auto"/>
             </w:pPr>
             <w:r>
               <w:rPr>
@@ -2342,7 +2415,7 @@
           </w:tcPr>
           <w:p>
             <w:pPr>
-              <w:spacing w:after="80" w:line="276" w:lineRule="auto"/>
+              <w:spacing w:after="60" w:line="269" w:lineRule="auto"/>
             </w:pPr>
             <w:r>
               <w:rPr>
@@ -2374,7 +2447,7 @@
           </w:tcPr>
           <w:p>
             <w:pPr>
-              <w:spacing w:after="80" w:line="276" w:lineRule="auto"/>
+              <w:spacing w:after="60" w:line="269" w:lineRule="auto"/>
             </w:pPr>
             <w:r>
               <w:rPr>
@@ -2412,7 +2485,7 @@
           </w:tcPr>
           <w:p>
             <w:pPr>
-              <w:spacing w:after="80" w:line="276" w:lineRule="auto"/>
+              <w:spacing w:after="60" w:line="269" w:lineRule="auto"/>
             </w:pPr>
             <w:r>
               <w:rPr>
@@ -2445,7 +2518,7 @@
           </w:tcPr>
           <w:p>
             <w:pPr>
-              <w:spacing w:after="80" w:line="276" w:lineRule="auto"/>
+              <w:spacing w:after="60" w:line="269" w:lineRule="auto"/>
             </w:pPr>
             <w:r>
               <w:rPr>
@@ -2478,7 +2551,7 @@
           </w:tcPr>
           <w:p>
             <w:pPr>
-              <w:spacing w:after="80" w:line="276" w:lineRule="auto"/>
+              <w:spacing w:after="60" w:line="269" w:lineRule="auto"/>
             </w:pPr>
             <w:r>
               <w:rPr>
@@ -2515,7 +2588,7 @@
           </w:tcPr>
           <w:p>
             <w:pPr>
-              <w:spacing w:after="80" w:line="276" w:lineRule="auto"/>
+              <w:spacing w:after="60" w:line="269" w:lineRule="auto"/>
             </w:pPr>
             <w:r>
               <w:rPr>
@@ -2547,7 +2620,7 @@
           </w:tcPr>
           <w:p>
             <w:pPr>
-              <w:spacing w:after="80" w:line="276" w:lineRule="auto"/>
+              <w:spacing w:after="60" w:line="269" w:lineRule="auto"/>
             </w:pPr>
             <w:r>
               <w:rPr>
@@ -2579,7 +2652,7 @@
           </w:tcPr>
           <w:p>
             <w:pPr>
-              <w:spacing w:after="80" w:line="276" w:lineRule="auto"/>
+              <w:spacing w:after="60" w:line="269" w:lineRule="auto"/>
             </w:pPr>
             <w:r>
               <w:rPr>
@@ -2617,7 +2690,7 @@
           </w:tcPr>
           <w:p>
             <w:pPr>
-              <w:spacing w:after="80" w:line="276" w:lineRule="auto"/>
+              <w:spacing w:after="60" w:line="269" w:lineRule="auto"/>
             </w:pPr>
             <w:r>
               <w:rPr>
@@ -2650,7 +2723,7 @@
           </w:tcPr>
           <w:p>
             <w:pPr>
-              <w:spacing w:after="80" w:line="276" w:lineRule="auto"/>
+              <w:spacing w:after="60" w:line="269" w:lineRule="auto"/>
             </w:pPr>
             <w:r>
               <w:rPr>
@@ -2683,7 +2756,7 @@
           </w:tcPr>
           <w:p>
             <w:pPr>
-              <w:spacing w:after="80" w:line="276" w:lineRule="auto"/>
+              <w:spacing w:after="60" w:line="269" w:lineRule="auto"/>
             </w:pPr>
             <w:r>
               <w:rPr>
@@ -2720,7 +2793,7 @@
           </w:tcPr>
           <w:p>
             <w:pPr>
-              <w:spacing w:after="80" w:line="276" w:lineRule="auto"/>
+              <w:spacing w:after="60" w:line="269" w:lineRule="auto"/>
             </w:pPr>
             <w:r>
               <w:rPr>
@@ -2752,7 +2825,7 @@
           </w:tcPr>
           <w:p>
             <w:pPr>
-              <w:spacing w:after="80" w:line="276" w:lineRule="auto"/>
+              <w:spacing w:after="60" w:line="269" w:lineRule="auto"/>
             </w:pPr>
             <w:r>
               <w:rPr>
@@ -2784,7 +2857,7 @@
           </w:tcPr>
           <w:p>
             <w:pPr>
-              <w:spacing w:after="80" w:line="276" w:lineRule="auto"/>
+              <w:spacing w:after="60" w:line="269" w:lineRule="auto"/>
             </w:pPr>
             <w:r>
               <w:rPr>
@@ -2821,7 +2894,7 @@
     </w:p>
     <w:p>
       <w:pPr>
-        <w:spacing w:after="80" w:line="276" w:lineRule="auto"/>
+        <w:spacing w:after="60" w:line="269" w:lineRule="auto"/>
       </w:pPr>
       <w:r>
         <w:rPr>
@@ -2834,7 +2907,72 @@
     </w:p>
     <w:p>
       <w:pPr>
-        <w:spacing w:after="80" w:line="276" w:lineRule="auto"/>
+        <w:pStyle w:val="Heading2"/>
+        <w:spacing w:before="120" w:after="60"/>
+      </w:pPr>
+      <w:r>
+        <w:t>Aily 读取共享飞书多维表格 Demo</w:t>
+      </w:r>
+    </w:p>
+    <w:p>
+      <w:pPr>
+        <w:spacing w:before="60" w:after="120"/>
+        <w:ind w:left="283" w:right="283"/>
+      </w:pPr>
+      <w:r>
+        <w:rPr>
+          <w:rFonts w:ascii="Consolas" w:hAnsi="Consolas"/>
+          <w:color w:val="2D3A58"/>
+          <w:sz w:val="16"/>
+        </w:rPr>
+        <w:t>顾问在飞书测试群 @「千面·OneKOS 内容搭档」并提出查询</w:t>
+        <w:br/>
+        <w:t xml:space="preserve">                              ↓</w:t>
+        <w:br/>
+        <w:t xml:space="preserve">                     Aily 识别查询意图</w:t>
+        <w:br/>
+        <w:t xml:space="preserve">                              ↓</w:t>
+        <w:br/>
+        <w:t xml:space="preserve">       读取已连接的团队共享飞书多维表格中的对应记录</w:t>
+        <w:br/>
+        <w:t xml:space="preserve">                              ↓</w:t>
+        <w:br/>
+        <w:t xml:space="preserve">      返回顾问画像、任务、内容成果或评论线索的结构化结果</w:t>
+        <w:br/>
+        <w:t xml:space="preserve">                              ↓</w:t>
+        <w:br/>
+        <w:t xml:space="preserve">            在群里解释当前状态并提示顾问下一步动作</w:t>
+      </w:r>
+    </w:p>
+    <w:p>
+      <w:pPr>
+        <w:spacing w:after="60" w:line="269" w:lineRule="auto"/>
+      </w:pPr>
+      <w:r>
+        <w:rPr>
+          <w:rFonts w:ascii="Microsoft YaHei" w:hAnsi="Microsoft YaHei" w:eastAsia="Microsoft YaHei"/>
+          <w:color w:val="253047"/>
+          <w:sz w:val="19"/>
+        </w:rPr>
+        <w:t>这条链路当前已经能够现场演示：顾问不用进入 Web 工作台或逐张查看 Base，只需在群里 @Aily 提问，即可获得共享多维表格中的业务数据。飞书多维表格是 Aily 与 OneKOS Web 共用的协作数据底座；Aily 负责群聊查询和解释，Web 负责内容生成、四重质检及完整业务流程展示。</w:t>
+      </w:r>
+    </w:p>
+    <w:p>
+      <w:pPr>
+        <w:spacing w:after="60" w:line="269" w:lineRule="auto"/>
+      </w:pPr>
+      <w:r>
+        <w:rPr>
+          <w:rFonts w:ascii="Microsoft YaHei" w:hAnsi="Microsoft YaHei" w:eastAsia="Microsoft YaHei"/>
+          <w:color w:val="253047"/>
+          <w:sz w:val="19"/>
+        </w:rPr>
+        <w:t>当前边界是：Aily 已能读取共享多维表格，但尚未直接调用 OneKOS Web 后端，因此当前演示是“Aily 群聊查数”和“Web 完整流程”两段能力。后续把后端部署为可安全访问的公网服务后，再由 Aily 从群聊中推动两段链路自动衔接。</w:t>
+      </w:r>
+    </w:p>
+    <w:p>
+      <w:pPr>
+        <w:spacing w:after="60" w:line="269" w:lineRule="auto"/>
       </w:pPr>
       <w:r>
         <w:rPr>
@@ -2857,7 +2995,7 @@
     <w:p>
       <w:pPr>
         <w:pStyle w:val="ListBullet"/>
-        <w:spacing w:after="80" w:line="276" w:lineRule="auto"/>
+        <w:spacing w:after="60" w:line="269" w:lineRule="auto"/>
       </w:pPr>
       <w:r>
         <w:rPr>
@@ -2865,13 +3003,13 @@
           <w:color w:val="253047"/>
           <w:sz w:val="19"/>
         </w:rPr>
-        <w:t>周三 15:00 前：完成飞书七表导入、Aily 配置、至少一条真实写回流程和 2—3 分钟 Demo。</w:t>
+        <w:t>周三 15:00 前：完成飞书七表导入、Aily 与数据库交互和 2—3 分钟 Demo。</w:t>
       </w:r>
     </w:p>
     <w:p>
       <w:pPr>
         <w:pStyle w:val="ListBullet"/>
-        <w:spacing w:after="80" w:line="276" w:lineRule="auto"/>
+        <w:spacing w:after="60" w:line="269" w:lineRule="auto"/>
       </w:pPr>
       <w:r>
         <w:rPr>
@@ -2879,13 +3017,13 @@
           <w:color w:val="253047"/>
           <w:sz w:val="19"/>
         </w:rPr>
-        <w:t>8 月 6—10 日：补齐四重质检、矩阵检测、评论线索与指标看板。</w:t>
+        <w:t>8 月 6—10 日：补齐四重质检、矩阵检测、评论线索与指标看板，完成 Aily 与后端的完整交互。</w:t>
       </w:r>
     </w:p>
     <w:p>
       <w:pPr>
         <w:pStyle w:val="ListBullet"/>
-        <w:spacing w:after="80" w:line="276" w:lineRule="auto"/>
+        <w:spacing w:after="60" w:line="269" w:lineRule="auto"/>
       </w:pPr>
       <w:r>
         <w:rPr>
@@ -2899,7 +3037,7 @@
     <w:p>
       <w:pPr>
         <w:pStyle w:val="ListBullet"/>
-        <w:spacing w:after="80" w:line="276" w:lineRule="auto"/>
+        <w:spacing w:after="60" w:line="269" w:lineRule="auto"/>
       </w:pPr>
       <w:r>
         <w:rPr>
@@ -2927,7 +3065,7 @@
   <w:p>
     <w:pPr>
       <w:pStyle w:val="Footer"/>
-      <w:spacing w:after="80" w:line="276" w:lineRule="auto"/>
+      <w:spacing w:after="60" w:line="269" w:lineRule="auto"/>
       <w:jc w:val="center"/>
     </w:pPr>
     <w:r>
@@ -2947,7 +3085,7 @@
   <w:p>
     <w:pPr>
       <w:pStyle w:val="Header"/>
-      <w:spacing w:after="80" w:line="276" w:lineRule="auto"/>
+      <w:spacing w:after="60" w:line="269" w:lineRule="auto"/>
       <w:jc w:val="right"/>
     </w:pPr>
     <w:r>

</xml_diff>